<commit_message>
Add weekly doc review automation and artifacts_31 July Update
Introduce a new weekly documentation review pipeline with a GitHub Actions workflow and `tools/weekly-doc-review.mjs`. The automation now checks live-branch alignment, reruns Jest and npm audit, writes refreshed AutoTest/audit outputs, tracks review state, and generates dated weekly review reports. Documentation was updated to describe the process and setup changes, and related report assets were refreshed (including removing the old `Automated_UAT_Test_Run_Report.docx`).
</commit_message>
<xml_diff>
--- a/Documentations/Cybersecurity_Protocol_Document.docx
+++ b/Documentations/Cybersecurity_Protocol_Document.docx
@@ -35,7 +35,7 @@
           <w:i/>
           <w:sz w:val="22"/>
         </w:rPr>
-        <w:t>First draft — current security posture, known exposures, and hardening protocol (dev-deploy-shafik-2 @ d38ff71)</w:t>
+        <w:t>First draft — current security posture, known exposures, and hardening protocol (nyunt/dev-W7.1, the live branch, @ e621194)</w:t>
       </w:r>
     </w:p>
     <w:p>
@@ -57,7 +57,7 @@
     </w:p>
     <w:p>
       <w:r>
-        <w:t>This document defines the current cybersecurity posture of the SmartRPD Web Application on dev-deploy-shafik-2, catalogues the concrete exposures found in the codebase and pipeline as of this draft, and sets out the protocol for closing them. It covers the frontend web client (this repository), its build/deploy pipeline (the GitHub Actions “Deploy Test Site” workflow -- see Documentations/setup/03-cicd-and-deployment-setup.md), and the data it handles -- including per-tooth clinical/case information treated here as sensitive patient-adjacent data even where no formal regulatory classification has been assigned.</w:t>
+        <w:t>This document defines the current cybersecurity posture of the SmartRPD Web Application on nyunt/dev-W7.1 (the live, deployed branch, built from dev-deploy-documentation), catalogues the concrete exposures found in the codebase and pipeline as of this draft, and sets out the protocol for closing them. It covers the frontend web client (this repository), its build/deploy pipeline (the GitHub Actions “Deploy Test Site” workflow -- see Documentations/setup/03-cicd-and-deployment-setup.md), and the data it handles -- including per-tooth clinical/case information treated here as sensitive patient-adjacent data even where no formal regulatory classification has been assigned.</w:t>
       </w:r>
     </w:p>
     <w:p>
@@ -428,12 +428,12 @@
         <w:pStyle w:val="Heading2"/>
       </w:pPr>
       <w:r>
-        <w:t>6.4 Help assistant (new feature) -- confirmed local-only, no data exfiltration</w:t>
+        <w:t>6.4 Help assistant (feature under active development) -- re-verified local-only, no data exfiltration</w:t>
       </w:r>
     </w:p>
     <w:p>
       <w:r>
-        <w:t>The new AI-powered help assistant (src/js/shared/helpMatcher.js, helpTopics.js, helpBot.js) was checked for outbound network calls -- none found. It's a local, rules-based text matcher over a static knowledge base bundled with the app; user questions typed into it are not sent to any third-party service. No finding here, noted for completeness given it's new functionality processing free-text user input.</w:t>
+        <w:t>The AI-powered help assistant (src/js/shared/helpMatcher.js, helpTopics.js, helpBot.js) was re-checked on this branch after two feature commits landed since the prior draft: an FAQ/fallback-guidance expansion (commit d583fbb, 2026-07-27) and reveal controls that click a topic's opener control before highlighting its target (commit e621194, 2026-07-28). Neither introduces an outbound network call -- a search for fetch/XMLHttpRequest/WebSocket across all three files returns nothing. It remains a local, rules-based text matcher over a static knowledge base bundled with the app; user questions typed into it are not sent to any third-party service. The reveal-control feature programmatically clicks existing UI controls and polls their visibility state -- it does not accept or render arbitrary HTML from user input. No finding here, re-confirmed given the feature grew substantially (helpBot.test.mjs: 71 -&gt; 94 tests) since the prior review.</w:t>
       </w:r>
     </w:p>
     <w:p>
@@ -536,7 +536,7 @@
     </w:p>
     <w:p>
       <w:r>
-        <w:t>`npm audit` against the current lockfile reports 6 known vulnerabilities (3 moderate, 2 high, 1 critical) -- a real improvement over an earlier snapshot of this app (29 vulnerabilities). All are transitive devDependencies (webpack-dev-server's sockjs/uuid chain, uglify-js pulled in via the unused top-level `require` package, and a new fast-uri host-confusion advisory) -- none currently reach the production bundle, limiting real-world exploitability, but a dev-server or build-time issue is still a risk to anyone running `npm run dev` or CI itself.</w:t>
+        <w:t>`npm audit` against the current lockfile reports 27 known vulnerabilities (3 moderate, 23 high, 1 critical) as of this re-audit -- up from the 6 (3 moderate, 2 high, 1 critical) recorded in the prior draft on dev-deploy-shafik-2, even though package.json and package-lock.json are byte-for-byte identical between the two branches. The jump is almost entirely two npm advisories published since the prior draft was written, not a dependency or code change on this branch: a brace-expansion DoS advisory (GHSA-mh99-v99m-4gvg) that fans out through the entire Jest dependency tree (minimatch -&gt; glob -&gt; @jest/* -&gt; jest/jest-cli), and a PostCSS path-traversal advisory (GHSA-r28c-9q8g-f849). All 27 are transitive devDependencies (webpack-dev-server's sockjs/uuid chain, uglify-js pulled in via the unused top-level `require` package, a fast-uri host-confusion advisory, plus the two new ones above) -- none currently reach the production bundle, limiting real-world exploitability, but a dev-server or build-time issue is still a risk to anyone running `npm run dev` or CI itself.</w:t>
       </w:r>
     </w:p>
     <w:tbl>
@@ -677,6 +677,114 @@
               <w:rPr>
                 <w:sz w:val="19"/>
               </w:rPr>
+              <w:t>brace-expansion (via minimatch/glob/Jest toolchain)</w:t>
+            </w:r>
+          </w:p>
+        </w:tc>
+        <w:tc>
+          <w:tcPr>
+            <w:tcW w:type="dxa" w:w="1152"/>
+          </w:tcPr>
+          <w:p>
+            <w:r>
+              <w:rPr>
+                <w:sz w:val="19"/>
+              </w:rPr>
+              <w:t>High</w:t>
+            </w:r>
+          </w:p>
+        </w:tc>
+        <w:tc>
+          <w:tcPr>
+            <w:tcW w:type="dxa" w:w="3024"/>
+          </w:tcPr>
+          <w:p>
+            <w:r>
+              <w:rPr>
+                <w:sz w:val="19"/>
+              </w:rPr>
+              <w:t>DoS via unbounded expansion length (GHSA-mh99-v99m-4gvg)</w:t>
+            </w:r>
+          </w:p>
+        </w:tc>
+        <w:tc>
+          <w:tcPr>
+            <w:tcW w:type="dxa" w:w="2880"/>
+          </w:tcPr>
+          <w:p>
+            <w:r>
+              <w:rPr>
+                <w:sz w:val="19"/>
+              </w:rPr>
+              <w:t>New advisory since the prior draft; fans out to 20+ Jest-toolchain packages. Fix requires `npm audit fix --force` (installs babel-jest@23.6.0, a breaking change) -- evaluate before applying.</w:t>
+            </w:r>
+          </w:p>
+        </w:tc>
+      </w:tr>
+      <w:tr>
+        <w:tc>
+          <w:tcPr>
+            <w:tcW w:type="dxa" w:w="2304"/>
+          </w:tcPr>
+          <w:p>
+            <w:r>
+              <w:rPr>
+                <w:sz w:val="19"/>
+              </w:rPr>
+              <w:t>postcss &lt;=8.5.17</w:t>
+            </w:r>
+          </w:p>
+        </w:tc>
+        <w:tc>
+          <w:tcPr>
+            <w:tcW w:type="dxa" w:w="1152"/>
+          </w:tcPr>
+          <w:p>
+            <w:r>
+              <w:rPr>
+                <w:sz w:val="19"/>
+              </w:rPr>
+              <w:t>High</w:t>
+            </w:r>
+          </w:p>
+        </w:tc>
+        <w:tc>
+          <w:tcPr>
+            <w:tcW w:type="dxa" w:w="3024"/>
+          </w:tcPr>
+          <w:p>
+            <w:r>
+              <w:rPr>
+                <w:sz w:val="19"/>
+              </w:rPr>
+              <w:t>Path traversal in sourceMappingURL auto-loading (GHSA-r28c-9q8g-f849)</w:t>
+            </w:r>
+          </w:p>
+        </w:tc>
+        <w:tc>
+          <w:tcPr>
+            <w:tcW w:type="dxa" w:w="2880"/>
+          </w:tcPr>
+          <w:p>
+            <w:r>
+              <w:rPr>
+                <w:sz w:val="19"/>
+              </w:rPr>
+              <w:t>New advisory since the prior draft. Fix available via `npm audit fix`.</w:t>
+            </w:r>
+          </w:p>
+        </w:tc>
+      </w:tr>
+      <w:tr>
+        <w:tc>
+          <w:tcPr>
+            <w:tcW w:type="dxa" w:w="2304"/>
+          </w:tcPr>
+          <w:p>
+            <w:r>
+              <w:rPr>
+                <w:sz w:val="19"/>
+              </w:rPr>
               <w:t>fast-uri 3.0.0-3.1.3</w:t>
             </w:r>
           </w:p>
@@ -786,11 +894,9 @@
         <w:rPr>
           <w:b/>
         </w:rPr>
-        <w:t xml:space="preserve">Protocol: </w:t>
+        <w:t>Protocol: run `npm audit fix` for the non-breaking fixes (fast-uri, postcss); evaluate `npm audit fix --force` for the brace-expansion/Jest chain and the uglify-js/uuid chains separately, since both pull in breaking-change upgrades that need a full test-suite re-run before accepting; evaluate removing the unused `require` package to drop the uglify-js chain outright; keep `npm audit` as a release-checklist item so this list doesn't silently regrow, and re-run it whenever this document is revisited -- the registry's advisory database changes independently of this repository's own commits.</w:t>
       </w:r>
-      <w:r>
-        <w:t>run `npm audit fix` for the non-breaking fixes; evaluate removing the unused `require` package to drop the uglify-js chain outright; keep `npm audit` as a release-checklist item so this list doesn't silently regrow.</w:t>
-      </w:r>
+      <w:r/>
     </w:p>
     <w:p>
       <w:pPr>
@@ -1549,7 +1655,7 @@
               <w:rPr>
                 <w:sz w:val="19"/>
               </w:rPr>
-              <w:t>6 known dependency vulnerabilities (dev-only today)</w:t>
+              <w:t>27 known dependency vulnerabilities (dev-only today; up from 6 due to two new registry advisories, not a code change)</w:t>
             </w:r>
           </w:p>
         </w:tc>
@@ -2135,7 +2241,7 @@
               <w:rPr>
                 <w:sz w:val="19"/>
               </w:rPr>
-              <w:t>dev-deploy-shafik-2 @ d38ff71 (frontend repository only — see §1 Scope)</w:t>
+              <w:t>nyunt/dev-W7.1, the live branch (built from dev-deploy-documentation @ e621194; frontend repository only — see §1 Scope)</w:t>
             </w:r>
           </w:p>
         </w:tc>
@@ -2163,7 +2269,7 @@
               <w:rPr>
                 <w:sz w:val="19"/>
               </w:rPr>
-              <w:t>24 July 2026</w:t>
+              <w:t>31 July 2026</w:t>
             </w:r>
           </w:p>
         </w:tc>
@@ -2390,6 +2496,60 @@
                 <w:sz w:val="19"/>
               </w:rPr>
               <w:t>Initial draft on dev-deploy-shafik-2: posture summary, 13 findings + 5 positive findings from direct code review, remediation roadmap.</w:t>
+            </w:r>
+          </w:p>
+        </w:tc>
+      </w:tr>
+      <w:tr>
+        <w:tc>
+          <w:tcPr>
+            <w:tcW w:type="dxa" w:w="1440"/>
+          </w:tcPr>
+          <w:p>
+            <w:r>
+              <w:rPr>
+                <w:sz w:val="19"/>
+              </w:rPr>
+              <w:t>0.2 (Draft)</w:t>
+            </w:r>
+          </w:p>
+        </w:tc>
+        <w:tc>
+          <w:tcPr>
+            <w:tcW w:type="dxa" w:w="1440"/>
+          </w:tcPr>
+          <w:p>
+            <w:r>
+              <w:rPr>
+                <w:sz w:val="19"/>
+              </w:rPr>
+              <w:t>31 July 2026</w:t>
+            </w:r>
+          </w:p>
+        </w:tc>
+        <w:tc>
+          <w:tcPr>
+            <w:tcW w:type="dxa" w:w="3456"/>
+          </w:tcPr>
+          <w:p>
+            <w:r>
+              <w:rPr>
+                <w:sz w:val="19"/>
+              </w:rPr>
+              <w:t>Shafik Hakim Bin Abdul Wahid (AI-assisted)</w:t>
+            </w:r>
+          </w:p>
+        </w:tc>
+        <w:tc>
+          <w:tcPr>
+            <w:tcW w:type="dxa" w:w="3024"/>
+          </w:tcPr>
+          <w:p>
+            <w:r>
+              <w:rPr>
+                <w:sz w:val="19"/>
+              </w:rPr>
+              <w:t>Re-targeted from dev-deploy-shafik-2 to nyunt/dev-W7.1 (the live/deployed branch, sourced from dev-deploy-documentation). All file-level findings re-verified as unaffected by the branch divergence except §6.4 (help assistant, re-checked after two new feature commits) and §9 (npm audit refreshed -- 27 vulnerabilities vs. 6, driven by two new registry advisories published since the prior draft, not a code change).</w:t>
             </w:r>
           </w:p>
         </w:tc>

</xml_diff>